<commit_message>
Add badges, filters, and per-age challenges (6 to 11+)
- Every activity now has where / time / cleanup / noise / players / ages
  in catalog.json, shown as colored badges on cards and activity pages
- Filter panel on home (all activities) and category pages: age, indoor
  vs outdoor, short/medium/long, cleanup none->big, silent->unusually
  loud, solo vs group; live counts per chip, choices remembered
- Age picker in the top bar; "Level Up" replaced by a By Age tab with a
  challenge for each age 6, 7, 8, 9, 10, 11+; the picked age is
  highlighted and is the only one printed
- Cleanup scale now starts at "none"; times retuned so Long exists
- Word files rebuilt with the same badges

Co-Authored-By: Claude Opus 5.5 <noreply@anthropic.com>
Claude-Session: https://claude.ai/code/session_01DQFJXtBZqNbt5SvSZ2ZQXM
</commit_message>
<xml_diff>
--- a/print/a4/four-color-pen--color-story.docx
+++ b/print/a4/four-color-pen--color-story.docx
@@ -2,7 +2,7 @@
 <file path=word/document.xml><?xml version="1.0" encoding="utf-8"?>
 <w:document xmlns:w="http://schemas.openxmlformats.org/wordprocessingml/2006/main" xmlns:m="http://schemas.openxmlformats.org/officeDocument/2006/math" xmlns:r="http://schemas.openxmlformats.org/officeDocument/2006/relationships" xmlns:o="urn:schemas-microsoft-com:office:office" xmlns:v="urn:schemas-microsoft-com:vml" xmlns:w10="urn:schemas-microsoft-com:office:word" xmlns:a="http://schemas.openxmlformats.org/drawingml/2006/main" xmlns:pic="http://schemas.openxmlformats.org/drawingml/2006/picture" xmlns:wp="http://schemas.openxmlformats.org/drawingml/2006/wordprocessingDrawing">
   <w:body>
-    <w:bookmarkStart w:id="39" w:name="Xfe86d920ab67eaaa28b53f9ed0afa79f6201337"/>
+    <w:bookmarkStart w:id="42" w:name="Xfe86d920ab67eaaa28b53f9ed0afa79f6201337"/>
     <w:p>
       <w:pPr>
         <w:pStyle w:val="Heading1"/>
@@ -15,56 +15,18 @@
       <w:pPr>
         <w:pStyle w:val="FirstParagraph"/>
       </w:pPr>
-      <w:r>
-        <w:t xml:space="preserve">⏱️</w:t>
-      </w:r>
-      <w:r>
-        <w:t xml:space="preserve"> </w:t>
-      </w:r>
       <w:r>
         <w:rPr>
           <w:bCs/>
           <w:b/>
         </w:rPr>
-        <w:t xml:space="preserve">20 min</w:t>
-      </w:r>
-      <w:r>
-        <w:t xml:space="preserve"> </w:t>
-      </w:r>
-      <w:r>
-        <w:t xml:space="preserve">· 🧽 Cleanup</w:t>
-      </w:r>
-      <w:r>
-        <w:t xml:space="preserve"> </w:t>
-      </w:r>
-      <w:r>
-        <w:rPr>
-          <w:bCs/>
-          <w:b/>
-        </w:rPr>
-        <w:t xml:space="preserve">$</w:t>
-      </w:r>
-      <w:r>
-        <w:t xml:space="preserve"> </w:t>
-      </w:r>
-      <w:r>
-        <w:t xml:space="preserve">(Quick wipe (2 min) 🧻) · 👧 Ages</w:t>
-      </w:r>
-      <w:r>
-        <w:t xml:space="preserve"> </w:t>
-      </w:r>
-      <w:r>
-        <w:rPr>
-          <w:bCs/>
-          <w:b/>
-        </w:rPr>
-        <w:t xml:space="preserve">5+</w:t>
-      </w:r>
-      <w:r>
-        <w:t xml:space="preserve"> </w:t>
-      </w:r>
-      <w:r>
-        <w:t xml:space="preserve">· 🛋️ Anywhere</w:t>
+        <w:t xml:space="preserve">⏳ Medium · 20 min</w:t>
+      </w:r>
+      <w:r>
+        <w:t xml:space="preserve"> </w:t>
+      </w:r>
+      <w:r>
+        <w:t xml:space="preserve">· ✨ No cleanup · 🔊 Not as quiet · 🏠🌳 In or out · 👤👥 Solo or group · 🎂 Ages 6–11+</w:t>
       </w:r>
     </w:p>
     <w:p>
@@ -478,22 +440,13 @@
     </w:p>
     <w:bookmarkEnd w:id="27"/>
     <w:bookmarkEnd w:id="28"/>
-    <w:bookmarkStart w:id="32" w:name="X90575d67fe14a03ef1898ae2a832688b148a116"/>
+    <w:bookmarkStart w:id="35" w:name="X67012d8413f3110ab14b8e2014e44e49739ed72"/>
     <w:p>
       <w:pPr>
         <w:pStyle w:val="Heading2"/>
       </w:pPr>
       <w:r>
-        <w:t xml:space="preserve">🌟 Level Up</w:t>
-      </w:r>
-    </w:p>
-    <w:bookmarkStart w:id="29" w:name="X7ac29abf67c27e4f28e3ba90c5f047b9d2e7a21"/>
-    <w:p>
-      <w:pPr>
-        <w:pStyle w:val="Heading3"/>
-      </w:pPr>
-      <w:r>
-        <w:t xml:space="preserve">🥉 Easy</w:t>
+        <w:t xml:space="preserve">🎚️ By Age</w:t>
       </w:r>
     </w:p>
     <w:p>
@@ -501,7 +454,7 @@
         <w:pStyle w:val="FirstParagraph"/>
       </w:pPr>
       <w:r>
-        <w:t xml:space="preserve">Grown-up writes. Kid</w:t>
+        <w:t xml:space="preserve">🎂 Pick the age. Every age can do the main steps — this is the</w:t>
       </w:r>
       <w:r>
         <w:t xml:space="preserve"> </w:t>
@@ -511,39 +464,47 @@
           <w:bCs/>
           <w:b/>
         </w:rPr>
-        <w:t xml:space="preserve">tells</w:t>
-      </w:r>
-      <w:r>
-        <w:t xml:space="preserve"> </w:t>
-      </w:r>
-      <w:r>
-        <w:t xml:space="preserve">the sentences. Or</w:t>
-      </w:r>
-      <w:r>
-        <w:t xml:space="preserve"> </w:t>
-      </w:r>
+        <w:t xml:space="preserve">extra challenge</w:t>
+      </w:r>
+      <w:r>
+        <w:t xml:space="preserve">.</w:t>
+      </w:r>
+    </w:p>
+    <w:bookmarkStart w:id="29" w:name="Xd9a988c13166dcb49a5852075871601ad97e5df"/>
+    <w:p>
+      <w:pPr>
+        <w:pStyle w:val="Heading3"/>
+      </w:pPr>
+      <w:r>
+        <w:t xml:space="preserve">6️⃣ Age 6</w:t>
+      </w:r>
+    </w:p>
+    <w:p>
+      <w:pPr>
+        <w:pStyle w:val="FirstParagraph"/>
+      </w:pPr>
       <w:r>
         <w:rPr>
           <w:bCs/>
           <w:b/>
         </w:rPr>
-        <w:t xml:space="preserve">draw</w:t>
-      </w:r>
-      <w:r>
-        <w:t xml:space="preserve"> </w:t>
-      </w:r>
-      <w:r>
-        <w:t xml:space="preserve">each turn! 🖍️</w:t>
+        <w:t xml:space="preserve">Tell</w:t>
+      </w:r>
+      <w:r>
+        <w:t xml:space="preserve"> </w:t>
+      </w:r>
+      <w:r>
+        <w:t xml:space="preserve">the story out loud. A grown-up writes it in the colors. 6 sentences.</w:t>
       </w:r>
     </w:p>
     <w:bookmarkEnd w:id="29"/>
-    <w:bookmarkStart w:id="30" w:name="Xf43672ad423d0282496fbf467992b0f330b443a"/>
+    <w:bookmarkStart w:id="30" w:name="X1dad34a091d90dc09f1f3b2f85b389fb95004f6"/>
     <w:p>
       <w:pPr>
         <w:pStyle w:val="Heading3"/>
       </w:pPr>
       <w:r>
-        <w:t xml:space="preserve">🥈 Medium</w:t>
+        <w:t xml:space="preserve">7️⃣ Age 7</w:t>
       </w:r>
     </w:p>
     <w:p>
@@ -551,35 +512,202 @@
         <w:pStyle w:val="FirstParagraph"/>
       </w:pPr>
       <w:r>
-        <w:t xml:space="preserve">Everyone writes their own sentences.</w:t>
-      </w:r>
-    </w:p>
-    <w:bookmarkEnd w:id="30"/>
-    <w:bookmarkStart w:id="31" w:name="X62a67ac50e3cebf2d23861cbcb09541e5aea6e9"/>
-    <w:p>
-      <w:pPr>
-        <w:pStyle w:val="Heading3"/>
-      </w:pPr>
-      <w:r>
-        <w:t xml:space="preserve">🥇 Hard</w:t>
-      </w:r>
-    </w:p>
-    <w:p>
-      <w:pPr>
-        <w:pStyle w:val="FirstParagraph"/>
-      </w:pPr>
+        <w:t xml:space="preserve">Write your</w:t>
+      </w:r>
+      <w:r>
+        <w:t xml:space="preserve"> </w:t>
+      </w:r>
       <w:r>
         <w:rPr>
           <w:bCs/>
           <w:b/>
         </w:rPr>
-        <w:t xml:space="preserve">Story Rules</w:t>
-      </w:r>
-      <w:r>
-        <w:t xml:space="preserve"> </w:t>
-      </w:r>
-      <w:r>
-        <w:t xml:space="preserve">🎲 Your story must include:</w:t>
+        <w:t xml:space="preserve">own</w:t>
+      </w:r>
+      <w:r>
+        <w:t xml:space="preserve"> </w:t>
+      </w:r>
+      <w:r>
+        <w:t xml:space="preserve">sentences. 8 total.</w:t>
+      </w:r>
+    </w:p>
+    <w:bookmarkEnd w:id="30"/>
+    <w:bookmarkStart w:id="31" w:name="X97592b81667438caff4f0ed360af5aa72e3327e"/>
+    <w:p>
+      <w:pPr>
+        <w:pStyle w:val="Heading3"/>
+      </w:pPr>
+      <w:r>
+        <w:t xml:space="preserve">8️⃣ Age 8</w:t>
+      </w:r>
+    </w:p>
+    <w:p>
+      <w:pPr>
+        <w:pStyle w:val="FirstParagraph"/>
+      </w:pPr>
+      <w:r>
+        <w:t xml:space="preserve">12 sentences. Read it aloud with a</w:t>
+      </w:r>
+      <w:r>
+        <w:t xml:space="preserve"> </w:t>
+      </w:r>
+      <w:r>
+        <w:rPr>
+          <w:bCs/>
+          <w:b/>
+        </w:rPr>
+        <w:t xml:space="preserve">different voice</w:t>
+      </w:r>
+      <w:r>
+        <w:t xml:space="preserve"> </w:t>
+      </w:r>
+      <w:r>
+        <w:t xml:space="preserve">for each color 🎭</w:t>
+      </w:r>
+    </w:p>
+    <w:bookmarkEnd w:id="31"/>
+    <w:bookmarkStart w:id="32" w:name="X708f460606dd1a76d0749f0618bc9d68251a2b7"/>
+    <w:p>
+      <w:pPr>
+        <w:pStyle w:val="Heading3"/>
+      </w:pPr>
+      <w:r>
+        <w:t xml:space="preserve">9️⃣ Age 9</w:t>
+      </w:r>
+    </w:p>
+    <w:p>
+      <w:pPr>
+        <w:pStyle w:val="FirstParagraph"/>
+      </w:pPr>
+      <w:r>
+        <w:rPr>
+          <w:bCs/>
+          <w:b/>
+        </w:rPr>
+        <w:t xml:space="preserve">Story rules</w:t>
+      </w:r>
+      <w:r>
+        <w:t xml:space="preserve"> </w:t>
+      </w:r>
+      <w:r>
+        <w:t xml:space="preserve">🎲 Must include: 💥 a sound word, 😢 a feeling, 🔄 a twist.</w:t>
+      </w:r>
+    </w:p>
+    <w:bookmarkEnd w:id="32"/>
+    <w:bookmarkStart w:id="33" w:name="X8171c026b6d3b019e037d636deb1627bab2ad11"/>
+    <w:p>
+      <w:pPr>
+        <w:pStyle w:val="Heading3"/>
+      </w:pPr>
+      <w:r>
+        <w:t xml:space="preserve">🔟 Age 10</w:t>
+      </w:r>
+    </w:p>
+    <w:p>
+      <w:pPr>
+        <w:pStyle w:val="FirstParagraph"/>
+      </w:pPr>
+      <w:r>
+        <w:rPr>
+          <w:bCs/>
+          <w:b/>
+        </w:rPr>
+        <w:t xml:space="preserve">Talking only</w:t>
+      </w:r>
+      <w:r>
+        <w:t xml:space="preserve"> </w:t>
+      </w:r>
+      <w:r>
+        <w:t xml:space="preserve">💬</w:t>
+      </w:r>
+      <w:r>
+        <w:br/>
+      </w:r>
+      <w:r>
+        <w:t xml:space="preserve">Characters can</w:t>
+      </w:r>
+      <w:r>
+        <w:t xml:space="preserve"> </w:t>
+      </w:r>
+      <w:r>
+        <w:rPr>
+          <w:bCs/>
+          <w:b/>
+        </w:rPr>
+        <w:t xml:space="preserve">only speak</w:t>
+      </w:r>
+      <w:r>
+        <w:t xml:space="preserve"> </w:t>
+      </w:r>
+      <w:r>
+        <w:t xml:space="preserve">— no narrator. Use real quotation marks: "Like this!"</w:t>
+      </w:r>
+    </w:p>
+    <w:bookmarkEnd w:id="33"/>
+    <w:bookmarkStart w:id="34" w:name="X02bfb3385b20ae9fc9ed6803eef42fea02d2b46"/>
+    <w:p>
+      <w:pPr>
+        <w:pStyle w:val="Heading3"/>
+      </w:pPr>
+      <w:r>
+        <w:t xml:space="preserve">🚀 Age 11+</w:t>
+      </w:r>
+    </w:p>
+    <w:p>
+      <w:pPr>
+        <w:pStyle w:val="FirstParagraph"/>
+      </w:pPr>
+      <w:r>
+        <w:rPr>
+          <w:bCs/>
+          <w:b/>
+        </w:rPr>
+        <w:t xml:space="preserve">Plan + edit</w:t>
+      </w:r>
+      <w:r>
+        <w:t xml:space="preserve"> </w:t>
+      </w:r>
+      <w:r>
+        <w:t xml:space="preserve">✂️</w:t>
+      </w:r>
+      <w:r>
+        <w:br/>
+      </w:r>
+      <w:r>
+        <w:t xml:space="preserve">Plan the shape first: beginning → rising problem → big moment → ending.</w:t>
+      </w:r>
+      <w:r>
+        <w:br/>
+      </w:r>
+      <w:r>
+        <w:t xml:space="preserve">After writing, become the editor: click</w:t>
+      </w:r>
+      <w:r>
+        <w:t xml:space="preserve"> </w:t>
+      </w:r>
+      <w:r>
+        <w:rPr>
+          <w:bCs/>
+          <w:b/>
+        </w:rPr>
+        <w:t xml:space="preserve">red</w:t>
+      </w:r>
+      <w:r>
+        <w:t xml:space="preserve"> </w:t>
+      </w:r>
+      <w:r>
+        <w:t xml:space="preserve">and fix 3 things.</w:t>
+      </w:r>
+    </w:p>
+    <w:bookmarkEnd w:id="34"/>
+    <w:bookmarkEnd w:id="35"/>
+    <w:bookmarkStart w:id="36" w:name="X9cc3fda027b658f876f44d44ddc22905faccd4e"/>
+    <w:p>
+      <w:pPr>
+        <w:pStyle w:val="Heading2"/>
+      </w:pPr>
+      <w:r>
+        <w:t xml:space="preserve">🧠 Why It Works</w:t>
       </w:r>
     </w:p>
     <w:p>
@@ -591,7 +719,23 @@
         <w:pStyle w:val="Compact"/>
       </w:pPr>
       <w:r>
-        <w:t xml:space="preserve">💥 a sound word (BOOM! SPLAT!)</w:t>
+        <w:t xml:space="preserve">🎨 Colors show</w:t>
+      </w:r>
+      <w:r>
+        <w:t xml:space="preserve"> </w:t>
+      </w:r>
+      <w:r>
+        <w:rPr>
+          <w:bCs/>
+          <w:b/>
+        </w:rPr>
+        <w:t xml:space="preserve">who said what</w:t>
+      </w:r>
+      <w:r>
+        <w:t xml:space="preserve"> </w:t>
+      </w:r>
+      <w:r>
+        <w:t xml:space="preserve">— like speech bubbles in comics.</w:t>
       </w:r>
     </w:p>
     <w:p>
@@ -603,7 +747,20 @@
         <w:pStyle w:val="Compact"/>
       </w:pPr>
       <w:r>
-        <w:t xml:space="preserve">😢 a feeling</w:t>
+        <w:t xml:space="preserve">🧱 Stories have a shape:</w:t>
+      </w:r>
+      <w:r>
+        <w:t xml:space="preserve"> </w:t>
+      </w:r>
+      <w:r>
+        <w:rPr>
+          <w:bCs/>
+          <w:b/>
+        </w:rPr>
+        <w:t xml:space="preserve">beginning → problem → fix</w:t>
+      </w:r>
+      <w:r>
+        <w:t xml:space="preserve">.</w:t>
       </w:r>
     </w:p>
     <w:p>
@@ -615,18 +772,17 @@
         <w:pStyle w:val="Compact"/>
       </w:pPr>
       <w:r>
-        <w:t xml:space="preserve">🔄 a twist nobody expected</w:t>
-      </w:r>
-    </w:p>
-    <w:bookmarkEnd w:id="31"/>
-    <w:bookmarkEnd w:id="32"/>
-    <w:bookmarkStart w:id="33" w:name="X9cc3fda027b658f876f44d44ddc22905faccd4e"/>
+        <w:t xml:space="preserve">🤝 Building on someone else's idea = teamwork!</w:t>
+      </w:r>
+    </w:p>
+    <w:bookmarkEnd w:id="36"/>
+    <w:bookmarkStart w:id="37" w:name="X6763fabfd04f5c4a4d62b566a897dedd22150e7"/>
     <w:p>
       <w:pPr>
         <w:pStyle w:val="Heading2"/>
       </w:pPr>
       <w:r>
-        <w:t xml:space="preserve">🧠 Why It Works</w:t>
+        <w:t xml:space="preserve">🛟 Grown-Up Notes</w:t>
       </w:r>
     </w:p>
     <w:p>
@@ -638,23 +794,7 @@
         <w:pStyle w:val="Compact"/>
       </w:pPr>
       <w:r>
-        <w:t xml:space="preserve">🎨 Colors show</w:t>
-      </w:r>
-      <w:r>
-        <w:t xml:space="preserve"> </w:t>
-      </w:r>
-      <w:r>
-        <w:rPr>
-          <w:bCs/>
-          <w:b/>
-        </w:rPr>
-        <w:t xml:space="preserve">who said what</w:t>
-      </w:r>
-      <w:r>
-        <w:t xml:space="preserve"> </w:t>
-      </w:r>
-      <w:r>
-        <w:t xml:space="preserve">— like speech bubbles in comics.</w:t>
+        <w:t xml:space="preserve">😄 Silly is good. Let it get weird.</w:t>
       </w:r>
     </w:p>
     <w:p>
@@ -666,20 +806,7 @@
         <w:pStyle w:val="Compact"/>
       </w:pPr>
       <w:r>
-        <w:t xml:space="preserve">🧱 Stories have a shape:</w:t>
-      </w:r>
-      <w:r>
-        <w:t xml:space="preserve"> </w:t>
-      </w:r>
-      <w:r>
-        <w:rPr>
-          <w:bCs/>
-          <w:b/>
-        </w:rPr>
-        <w:t xml:space="preserve">beginning → problem → fix</w:t>
-      </w:r>
-      <w:r>
-        <w:t xml:space="preserve">.</w:t>
+        <w:t xml:space="preserve">⏱️ Little kids: stop at 6 sentences.</w:t>
       </w:r>
     </w:p>
     <w:p>
@@ -691,62 +818,16 @@
         <w:pStyle w:val="Compact"/>
       </w:pPr>
       <w:r>
-        <w:t xml:space="preserve">🤝 Building on someone else's idea = teamwork!</w:t>
-      </w:r>
-    </w:p>
-    <w:bookmarkEnd w:id="33"/>
-    <w:bookmarkStart w:id="34" w:name="X6763fabfd04f5c4a4d62b566a897dedd22150e7"/>
+        <w:t xml:space="preserve">📸 Snap a photo of good ones — they're fun to reread later.</w:t>
+      </w:r>
+    </w:p>
+    <w:bookmarkEnd w:id="37"/>
+    <w:bookmarkStart w:id="38" w:name="X1e8c337912f0193a41fd873cd12ea5fd283b9ee"/>
     <w:p>
       <w:pPr>
         <w:pStyle w:val="Heading2"/>
       </w:pPr>
       <w:r>
-        <w:t xml:space="preserve">🛟 Grown-Up Notes</w:t>
-      </w:r>
-    </w:p>
-    <w:p>
-      <w:pPr>
-        <w:numPr>
-          <w:ilvl w:val="0"/>
-          <w:numId w:val="1006"/>
-        </w:numPr>
-        <w:pStyle w:val="Compact"/>
-      </w:pPr>
-      <w:r>
-        <w:t xml:space="preserve">😄 Silly is good. Let it get weird.</w:t>
-      </w:r>
-    </w:p>
-    <w:p>
-      <w:pPr>
-        <w:numPr>
-          <w:ilvl w:val="0"/>
-          <w:numId w:val="1006"/>
-        </w:numPr>
-        <w:pStyle w:val="Compact"/>
-      </w:pPr>
-      <w:r>
-        <w:t xml:space="preserve">⏱️ Little kids: stop at 6 sentences.</w:t>
-      </w:r>
-    </w:p>
-    <w:p>
-      <w:pPr>
-        <w:numPr>
-          <w:ilvl w:val="0"/>
-          <w:numId w:val="1006"/>
-        </w:numPr>
-        <w:pStyle w:val="Compact"/>
-      </w:pPr>
-      <w:r>
-        <w:t xml:space="preserve">📸 Snap a photo of good ones — they're fun to reread later.</w:t>
-      </w:r>
-    </w:p>
-    <w:bookmarkEnd w:id="34"/>
-    <w:bookmarkStart w:id="35" w:name="X1e8c337912f0193a41fd873cd12ea5fd283b9ee"/>
-    <w:p>
-      <w:pPr>
-        <w:pStyle w:val="Heading2"/>
-      </w:pPr>
-      <w:r>
         <w:t xml:space="preserve">🧽 Cleanup</w:t>
       </w:r>
     </w:p>
@@ -755,21 +836,11 @@
         <w:pStyle w:val="FirstParagraph"/>
       </w:pPr>
       <w:r>
-        <w:rPr>
-          <w:bCs/>
-          <w:b/>
-        </w:rPr>
-        <w:t xml:space="preserve">$</w:t>
-      </w:r>
-      <w:r>
-        <w:t xml:space="preserve"> </w:t>
-      </w:r>
-      <w:r>
-        <w:t xml:space="preserve">— click the pen closed! 🖊️</w:t>
-      </w:r>
-    </w:p>
-    <w:bookmarkEnd w:id="35"/>
-    <w:bookmarkStart w:id="38" w:name="X50cf555741e6e45190901c440e88d3230da7c1a"/>
+        <w:t xml:space="preserve">click the pen closed! 🖊️</w:t>
+      </w:r>
+    </w:p>
+    <w:bookmarkEnd w:id="38"/>
+    <w:bookmarkStart w:id="41" w:name="X50cf555741e6e45190901c440e88d3230da7c1a"/>
     <w:p>
       <w:pPr>
         <w:pStyle w:val="Heading2"/>
@@ -779,7 +850,7 @@
         <w:t xml:space="preserve">🖨️ Printable</w:t>
       </w:r>
     </w:p>
-    <w:bookmarkStart w:id="36" w:name="X057be7e3f42ec1dcd3017384d8c6cd1f6c7e987"/>
+    <w:bookmarkStart w:id="39" w:name="X057be7e3f42ec1dcd3017384d8c6cd1f6c7e987"/>
     <w:p>
       <w:pPr>
         <w:pStyle w:val="Heading3"/>
@@ -976,8 +1047,8 @@
         </w:tc>
       </w:tr>
     </w:tbl>
-    <w:bookmarkEnd w:id="36"/>
-    <w:bookmarkStart w:id="37" w:name="Xdc64672c95fd0bb91f5a0a097d075abf976128b"/>
+    <w:bookmarkEnd w:id="39"/>
+    <w:bookmarkStart w:id="40" w:name="Xdc64672c95fd0bb91f5a0a097d075abf976128b"/>
     <w:p>
       <w:pPr>
         <w:pStyle w:val="Heading3"/>
@@ -1074,9 +1145,9 @@
         <w:t xml:space="preserve">🏁</w:t>
       </w:r>
     </w:p>
-    <w:bookmarkEnd w:id="37"/>
-    <w:bookmarkEnd w:id="38"/>
-    <w:bookmarkEnd w:id="39"/>
+    <w:bookmarkEnd w:id="40"/>
+    <w:bookmarkEnd w:id="41"/>
+    <w:bookmarkEnd w:id="42"/>
     <w:sectPr>
       <w:pgSz w:h="16838" w:w="11906"/>
       <w:pgMar w:bottom="850" w:left="850" w:right="850" w:top="850"/>
@@ -1278,9 +1349,6 @@
     <w:abstractNumId w:val="991"/>
   </w:num>
   <w:num w:numId="1005">
-    <w:abstractNumId w:val="991"/>
-  </w:num>
-  <w:num w:numId="1006">
     <w:abstractNumId w:val="991"/>
   </w:num>
 </w:numbering>

</xml_diff>